<commit_message>
Refocus October 30 slides on integrated results and timing limitations
</commit_message>
<xml_diff>
--- a/presentations/20261030/speaker_notes.docx
+++ b/presentations/20261030/speaker_notes.docx
@@ -7,14 +7,14 @@
         <w:pStyle w:val="Title"/>
       </w:pPr>
       <w:r>
-        <w:t>2026年10月30日　発表メモ</w:t>
+        <w:t>2026年10月30日　発表メモ（改訂版）</w:t>
       </w:r>
     </w:p>
     <w:p>
       <w:r>
         <w:t>37023492　棚橋 悠</w:t>
         <w:br/>
-        <w:t>本編10枚＋補足2枚。本文をそのまま読み上げる想定です。</w:t>
+        <w:t>本編11枚＋補足2枚。本文をそのまま読み上げる想定です。</w:t>
       </w:r>
     </w:p>
     <w:p>
@@ -27,7 +27,7 @@
     </w:p>
     <w:p>
       <w:r>
-        <w:t>スコアボード認識と投球検出による野球イベント検出について、今週の進捗を報告します。今週は、これまで個別に使っていたYOLO、PaddleOCR、VideoMAEによる処理をまとめ、同じ動画の時刻で結果を照合しました。</w:t>
+        <w:t>今週は、これまでに実装してきたスコアボード認識と投球区間の検出を、5回裏の同じ動画全体に適用しました。今回は、全部を適用してどのような状況を投球に対応付けられたかと、そこで残った課題を報告します。</w:t>
       </w:r>
     </w:p>
     <w:p>
@@ -35,12 +35,12 @@
         <w:pStyle w:val="Heading1"/>
       </w:pPr>
       <w:r>
-        <w:t>2. 今週したこと</w:t>
+        <w:t>2. これまでの研究と今週の位置付け</w:t>
       </w:r>
     </w:p>
     <w:p>
       <w:r>
-        <w:t>今週は、これまで別々に使っていた3つの処理を、同じ映像に適用して結果をまとめました。YOLOでスコアボードとカウントなどの表示を検出し、PaddleOCRでイニングと得点を読み、VideoMAEの特徴量とCompact ActionFormerで投球区間の候補を出しました。対象は5回裏の動画全体です。さらに、投球候補と前後の表示を照合し、確認画像、時系列グラフ、CSVとして保存できるようにしました。</w:t>
+        <w:t>これまでは、YOLOでカウントと走者を検出し、PaddleOCRでイニングと得点を認識してきました。9月には、表示の変化を使ったイベントの推定とCSVへの出力も行っています。その後、VideoMAEの特徴量とCompact ActionFormerを使い、投球区間を確認してきました。今週は、これらの処理を5回裏全体にまとめて適用し、投球候補と、カウント、走者、回、得点を同じ動画の時刻で対応付けました。投球と各状況を一緒に照合した結果が、今回の報告の中心です。</w:t>
       </w:r>
     </w:p>
     <w:p>
@@ -48,12 +48,12 @@
         <w:pStyle w:val="Heading1"/>
       </w:pPr>
       <w:r>
-        <w:t>3. 目的と使用データ</w:t>
+        <w:t>3. 今週まとめて適用した内容</w:t>
       </w:r>
     </w:p>
     <w:p>
       <w:r>
-        <w:t>目的は、投球が行われた時刻と、スコアボードの変化を対応付け、野球のイベント判定につなげることです。今回は5回裏の動画全体、約8分50秒を使用しました。フレームレートは30fpsで、総フレーム数は15,906です。約134分あるtest.mp4は、このCPU環境では1時間以内の処理が見込めなかったため、指定した代替の5ura.mp4を使いました。既存の学習済みモデルを利用し、今回の動画で追加学習はしていません。</w:t>
+        <w:t>対象は5ura.mp4の全体、530.2秒です。既存の学習済みモデルを使い、今回の動画での追加学習はしていません。YOLOでB/S/Oと走者、PaddleOCRで回と得点を読み、VideoMAEとCompact ActionFormerで投球区間の候補を出しました。投球候補の前後で同じB/S/Oが連続して得られる範囲を探し、状況を対応付けました。現行の照合では、投球後に最初に得られた安定状態を使っています。この表示の採用時刻が、後で説明する課題につながりました。</w:t>
       </w:r>
     </w:p>
     <w:p>
@@ -61,12 +61,12 @@
         <w:pStyle w:val="Heading1"/>
       </w:pPr>
       <w:r>
-        <w:t>4. 3つの処理を同じ時刻で照合</w:t>
+        <w:t>4. 全処理を動画全体に適用した結果</w:t>
       </w:r>
     </w:p>
     <w:p>
       <w:r>
-        <w:t>処理の役割は、YOLOがスコアボードの位置と、内部のボール、ストライク、アウト、走者の表示です。PaddleOCRは、YOLOが切り出した枠内のイニングと得点を読みます。一方、VideoMAEは元映像の16フレームから特徴量を抽出し、Compact ActionFormerが投球の開始と終了を推定します。この区間候補の前後で、表示がどう変わったかを同じ動画の時刻で照合しました。例えば、投球前が2ストライクで、前後のカウントが変わらない場合を確認対象にします。ただし、この条件だけでファウルと確定するものではありません。</w:t>
+        <w:t>全体の適用結果です。投球区間の候補は65区間で、重なりを表示上まとめると34候補群でした。34は実際の投球数を確定した値ではありません。上から、投球区間候補、B/S/O、走者、得点を同じ時刻で並べています。走者欄の黄色はあり、灰色はなしと認識した時刻で、白は未取得です。このように、投球だけでなく、その付近の試合状況も同じ時系列で追える形にしました。読み取れない場所は、0や走者なしで埋めていません。</w:t>
       </w:r>
     </w:p>
     <w:p>
@@ -74,12 +74,12 @@
         <w:pStyle w:val="Heading1"/>
       </w:pPr>
       <w:r>
-        <w:t>5. 動画全体に適用した結果</w:t>
+        <w:t>5. 前後の全項目が揃ったのは9候補群</w:t>
       </w:r>
     </w:p>
     <w:p>
       <w:r>
-        <w:t>動画全体への適用では、Soft-NMS後に65個の区間候補が残りました。重なる候補を表示上まとめると34候補群になりました。この34という数は、実際の投球数を確定したものではありません。赤線が投球区間候補で、その高さがモデルのスコアです。中央はYOLOによるボール、ストライク、アウト、下段はOCRによる得点の取得値です。表示がない場面や読み取れない場面は、不明として残しています。今回の動画には正解注釈をまだ作っていないため、正解の区間を示す帯や、平均tIoUは付けていません。</w:t>
+        <w:t>34候補群のうち、前後のB/S/Oを照合できたものは11候補群でした。そのうち9候補群では、B/S/Oに加えて、回と表裏、両チームの得点、各塁の走者の認識値も前後で揃いました。残りの2候補群は、OCRの項目が一部取得できていません。前後のB/S/Oが不足したものは23候補群でした。これは、全処理を適用したときに必要な項目が揃った数であり、9候補群で正しくイベントを判定できたという意味ではありません。</w:t>
       </w:r>
     </w:p>
     <w:p>
@@ -87,12 +87,12 @@
         <w:pStyle w:val="Heading1"/>
       </w:pPr>
       <w:r>
-        <w:t>6. 投球前後の表示を照合した結果</w:t>
+        <w:t>6. 投球にカウントと走者・得点を付与</w:t>
       </w:r>
     </w:p>
     <w:p>
       <w:r>
-        <w:t>34候補群を、前後のカウントから整理した結果です。ストライク表示が増えたものが3候補群、ボール表示が増えたものが1候補群でした。2ストライク未満でカウントが変わらないものが5候補群、2ストライクで変わらないものが2候補群でした。残りの23候補群は、前後のどちらか、または両方の表示が不足し、判定を保留しています。これは表示変化を機械的に整理した数であり、それぞれの投球結果が正しく分類できた割合を表すものではありません。</w:t>
+        <w:t>全項目を対応付けた例です。293.11秒から294.85秒に投球候補があり、その前後は5回裏、0対0、一塁走者あり、2アウトという状況でした。投球前の291.5秒では2ボール0ストライク、投球後に表示を取得した297.5秒では2ボール1ストライクです。回、得点、走者が変わらず、ストライク表示が増えたことを、この投球候補に対応付けられました。投球区間だけを出す場合や、表示の変化だけを見る場合よりも、どの状況の投球で表示が変わったかまで記録できています。</w:t>
       </w:r>
     </w:p>
     <w:p>
@@ -100,12 +100,12 @@
         <w:pStyle w:val="Heading1"/>
       </w:pPr>
       <w:r>
-        <w:t>7. 2ストライク後にカウント不変の例</w:t>
+        <w:t>7. 得点・走者の異なる状況も記録</w:t>
       </w:r>
     </w:p>
     <w:p>
       <w:r>
-        <w:t>具体例として、約113.41秒から115.02秒の候補を示します。この候補の投球検出スコアは約0.966でした。直前の113.0秒と直後の116.0秒を比べると、どちらも0ボール、2ストライク、1アウトと読み取られています。このため、2ストライク後にカウントが変わらない確認対象として残しました。同じ条件に該当したものは、約155.31秒から157.27秒にもあり、合計2候補群でした。ここでのスコアは投球区間の検出スコアで、ファウルの確率ではありません。</w:t>
+        <w:t>別の例では、候補26の区間内にある367.0秒で、5回裏、0対0、3ボール2ストライク2アウト、二塁走者ありという値を取得しました。一方、候補31の直後の436.5秒では、5回裏、0対1、0ボール0ストライク2アウト、一塁走者ありでした。得点だけでなく、投球候補と、その付近のカウントや走者を一緒に記録できています。ただし、間の表示が不足しているため、候補26が得点につながった投球だった、あるいは何秒で得点した、という対応までは確定していません。</w:t>
       </w:r>
     </w:p>
     <w:p>
@@ -113,12 +113,12 @@
         <w:pStyle w:val="Heading1"/>
       </w:pPr>
       <w:r>
-        <w:t>8. カウント不変だけでは確定できない</w:t>
+        <w:t>8. 2ストライク後の条件を投球に適用</w:t>
       </w:r>
     </w:p>
     <w:p>
       <w:r>
-        <w:t>ただし、投球直後はスコアボードの更新が間に合っていない可能性があります。約155.31秒から157.27秒の候補では、158.0秒に打者が走り出す場面が含まれますが、取得された表示は、投球前と同じ0ボール、2ストライク、1アウトでした。この例からも、短時間カウントが同じというだけで、ファウルと判断することはできません。今回の2候補群は、あくまで確認対象です。今後は、表示の更新を待つ処理に加え、投球後の映像や次の表示も確認し、実際の結果と対応付ける必要があります。</w:t>
+        <w:t>9月に考えた、2ストライクで投球の前後の状況が変わらない場面という条件を、今回は検出した投球区間の前後に適用しました。現行の最初の安定状態を使う照合では、113.41秒から115.02秒と、155.31秒から157.27秒の2候補群が、B/S/O不変として残りました。どちらも0ボール2ストライク1アウトです。ただし、これは自動処理が確認対象として残した数で、ファウルを2件正しく検出できたという意味ではありません。</w:t>
       </w:r>
     </w:p>
     <w:p>
@@ -126,12 +126,12 @@
         <w:pStyle w:val="Heading1"/>
       </w:pPr>
       <w:r>
-        <w:t>9. 得点表示を読み取った例</w:t>
+        <w:t>9. 表示の採用時刻で照合結果が変わる</w:t>
       </w:r>
     </w:p>
     <w:p>
       <w:r>
-        <w:t>得点表示については、367.0秒の取得値が0対0、434.5秒の取得値が0対1でした。これにより、異なる時刻の得点表示を読み取れていることを確認しました。ただし、その間の表示が不足しているため、正確に何秒で得点したかまでは特定していません。また、細い数字の1を文字検出が見落とす場面がありました。この場合は、切り出した得点欄を同じOCRの文字認識モデルへ直接渡し、2通りの切り出しで同じ数値が得られた場合だけ採用しました。</w:t>
+        <w:t>候補11について、投球後の表示を続けて確認しました。投球前の154.5秒と、直後の158.0秒は、どちらも0ボール2ストライク1アウトです。しかし、その後の161.5秒では、1ボール2ストライク1アウトを取得しています。元の照合は、158.0秒から158.5秒の最初の安定状態を採用したため、不変と整理されていました。同じ認識記録でも、その後の値を確認すると、ボールが増えた状態になります。このため、直後の古い表示で判定していないかを確認する必要があります。認識値の違いを示したもので、実際の投球結果の正解判定は別に必要です。</w:t>
       </w:r>
     </w:p>
     <w:p>
@@ -139,12 +139,25 @@
         <w:pStyle w:val="Heading1"/>
       </w:pPr>
       <w:r>
-        <w:t>10. 来週すること</w:t>
+        <w:t>10. 全処理の適用で分かったこと</w:t>
       </w:r>
     </w:p>
     <w:p>
       <w:r>
-        <w:t>来週はまず、5回裏の動画全体に、投球の開始と終了、ファウルなどの結果の正解注釈を付けます。そのうえで、投球検出の見逃しと誤検出を数え、区間の重なりも評価します。イベントの判定精度は、投球区間の検出精度とは分けて確認します。また、投球直後の古い表示を採用しないように、表示の更新を待つ方法や、画面に戻ってから照合する方法を検討します。投球と守備動作の区別や、映像と表示の統合に関する先行研究も整理し、別の動画でも再現するかを確認したいと考えています。</w:t>
+        <w:t>今週新たに確認した点は、投球区間に、カウント、走者、回、得点をまとめて付与できたことです。前後の全項目が揃ったのは9候補群でした。また、表示変化の時刻だけではなく、それに対応する投球候補まで示せるようになりました。一方、前後の表示が不足する23候補群があり、取得できても採用する時刻によって不変という整理が変わる例がありました。各認識処理の結果を並べるだけでなく、どの時点の表示を投球に対応付けるかが、イベント判定に必要だと分かりました。</w:t>
+      </w:r>
+    </w:p>
+    <w:p>
+      <w:pPr>
+        <w:pStyle w:val="Heading1"/>
+      </w:pPr>
+      <w:r>
+        <w:t>11. 来週すること</w:t>
+      </w:r>
+    </w:p>
+    <w:p>
+      <w:r>
+        <w:t>次は5回裏全体に、実際の投球区間と、ファウルなどの結果の正解注釈を付けます。そのうえで、表示の更新や再表示を待つ方法と、前後の採用値の決め方を検討します。投球区間の見逃しや誤検出の評価と、その投球へ正しい状況や結果を対応付けたかの評価は分けて行います。今回の動画を使った調整の後には、別の動画でも確認します。今週は、全部を適用した結果を取得する段階から、投球と状況の対応付けを評価するための具体的な課題まで整理しました。</w:t>
       </w:r>
     </w:p>
     <w:p>
@@ -157,7 +170,7 @@
         <w:pStyle w:val="Heading1"/>
       </w:pPr>
       <w:r>
-        <w:t>質疑時に使う補足スライド</w:t>
+        <w:t>質疑用の補足スライド</w:t>
       </w:r>
     </w:p>
     <w:p>
@@ -165,12 +178,12 @@
         <w:pStyle w:val="Heading1"/>
       </w:pPr>
       <w:r>
-        <w:t>11. 補足：前回の結果との違い</w:t>
+        <w:t>12. 補足：他の照合例と結果の内訳</w:t>
       </w:r>
     </w:p>
     <w:p>
       <w:r>
-        <w:t>前回の10動画、24球については、目視で設定したおおよその投球区間と、各投球に対応する最高スコア候補を比較し、平均tIoUが0.711でした。これは区間の重なりを見た結果で、守備動作への余分な候補を罰する評価ではありません。今回の5回裏全体は、まだ正解注釈を作っていないため、同じ数値を算出していません。前回の0.711を、今回の統合処理の精度として示すことはできません。</w:t>
+        <w:t>ほかの全項目が揃った例では、19.86秒から22.01秒と、44.07秒から46.34秒に対応してストライク表示が増え、33.66秒から35.91秒ではボール表示が増えました。前後のB/S/Oを照合できた11候補群の内訳は、ストライク表示増加3、ボール表示増加1、2ストライク未満で不変5、2ストライクで不変2です。最後の不変2は元の最初の安定状態を使った整理で、後の時刻を追うと候補11ではボール表示が増えています。これは結果の一貫性を調べた追加確認で、正解注釈に基づく分類精度ではありません。</w:t>
       </w:r>
     </w:p>
     <w:p>
@@ -178,12 +191,12 @@
         <w:pStyle w:val="Heading1"/>
       </w:pPr>
       <w:r>
-        <w:t>12. 補足：今回の処理条件</w:t>
+        <w:t>13. 補足：従来の精度評価との違い</w:t>
       </w:r>
     </w:p>
     <w:p>
       <w:r>
-        <w:t>スコアボードと内部のランプは、提供された2段階のYOLOで検出しました。表示は0.5秒ごと、OCRは表示があるときに原則2秒以上の間隔で実行しています。VideoMAEは16フレームを8フレーム間隔で取得し、768次元の特徴量を抽出しました。区間検出には、以前inning1tで学習したCompact ActionFormerを使っています。Soft-NMS後のスコア0.15以上を保持し、表示用の候補群は時間的IoUが0.25以上の重なりを基準にまとめました。表示が取得できなかった時刻は0に置き換えていません。</w:t>
+        <w:t>7月には静止画上のカウントや走者を対象に適合率と再現率を確認しました。10月の短編10動画24球では、目視の参考区間に対する選んだ投球候補の平均tIoUが0.711でした。今回の9候補群や23候補群は、同じ動画に全処理を適用したときの項目の取得状況を数えたものです。対象や数えているものが異なるため、前の精度より良くなったか悪くなったかは比較できません。今回の正解注釈を作り、投球区間とイベントの対応付けをそれぞれ評価する必要があります。</w:t>
       </w:r>
     </w:p>
     <w:p>
@@ -200,8 +213,16 @@
       </w:r>
     </w:p>
     <w:p>
+      <w:pPr>
+        <w:pStyle w:val="Heading2"/>
+      </w:pPr>
       <w:r>
-        <w:t>ここからは、発表本文とは別の質疑用メモです。</w:t>
+        <w:t>Q1. これまでと比べて、今週初めて確認した結果は何ですか。</w:t>
+      </w:r>
+    </w:p>
+    <w:p>
+      <w:r>
+        <w:t>スコアボード認識やCSV化自体は以前から行っています。今週は、同じ5回裏全体に既存の全処理を適用し、投球候補にB/S/O、走者、回、得点を同じ時刻で対応付けました。前後の全項目が揃った9候補群の例と、表示の採用時刻で不変という整理が変わる例を示しました。</w:t>
       </w:r>
     </w:p>
     <w:p>
@@ -209,12 +230,12 @@
         <w:pStyle w:val="Heading2"/>
       </w:pPr>
       <w:r>
-        <w:t>Q1. 34候補群は34球ということですか。</w:t>
+        <w:t>Q2. 全項目が揃った9候補群は、9球を正しく判定できたということですか。</w:t>
       </w:r>
     </w:p>
     <w:p>
       <w:r>
-        <w:t>34球とは限りません。Soft-NMS後の65区間を重なりに応じて34群に整理した数です。誤検出やリプレイが含まれる可能性があり、見逃した投球も正解注釈と比較しないと分かりません。</w:t>
+        <w:t>正しく判定できた数ではありません。34候補群のうち前後のB/S/Oが取得できた11群について、回・表裏・両チーム得点・各塁走者も前後とも不明でないものを数えると9群でした。認識値や投球結果の正しさは正解注釈との比較が必要です。</w:t>
       </w:r>
     </w:p>
     <w:p>
@@ -222,12 +243,12 @@
         <w:pStyle w:val="Heading2"/>
       </w:pPr>
       <w:r>
-        <w:t>Q2. 2候補群はファウルを正しく検出できたということですか。</w:t>
+        <w:t>Q3. 11候補群と9候補群は何が違いますか。</w:t>
       </w:r>
     </w:p>
     <w:p>
       <w:r>
-        <w:t>まだそのようには言えません。確認したのは投球前後のB/S/Oが2ストライクのまま同じという条件です。表示更新の遅れでも該当するため、映像と実際の結果を確認する必要があります。</w:t>
+        <w:t>11群は前後のB/S/Oを照合できた数です。そのうち候補7は後のOCR値が不足し、候補8は前の表裏が不明です。これら2群を除く9群では、回・表裏・両チームの得点・各塁走者も前後で取得されています。</w:t>
       </w:r>
     </w:p>
     <w:p>
@@ -235,12 +256,12 @@
         <w:pStyle w:val="Heading2"/>
       </w:pPr>
       <w:r>
-        <w:t>Q3. 155秒付近はファウルではないのではありませんか。</w:t>
+        <w:t>Q4. 3つ全部を使った具体例はありますか。</w:t>
       </w:r>
     </w:p>
     <w:p>
       <w:r>
-        <w:t>158.0秒には打者が走り出す場面があり、直後の表示だけでは結果を確定できません。この例は、カウント不変をそのままファウルにする方法の限界として示しています。ファウル確定のラベルは付けていません。</w:t>
+        <w:t>候補22です。VideoMAEとCompact ActionFormerが293.11–294.85秒の区間候補を出し、YOLOは一塁走者あり、2アウトでストライク表示が0から1になったと取得しました。PaddleOCRは前後とも5回裏、0対0と読みました。これらを一つの候補の記録として対応付けました。</w:t>
       </w:r>
     </w:p>
     <w:p>
@@ -248,12 +269,12 @@
         <w:pStyle w:val="Heading2"/>
       </w:pPr>
       <w:r>
-        <w:t>Q4. YOLOとPaddleOCRの役割は何が違いますか。</w:t>
+        <w:t>Q5. YOLOとPaddleOCRは、これまでも一緒に使っていませんでしたか。</w:t>
       </w:r>
     </w:p>
     <w:p>
       <w:r>
-        <w:t>YOLOはスコアボードの枠と、その中のB/S/Oランプや走者表示を検出します。PaddleOCRは、切り出した枠内のイニングや得点の文字を読みます。今回のB/S/OはOCRで数えたものではありません。</w:t>
+        <w:t>はい。以前からスコアボードの切り出しと文字認識、表示変化のCSV化は行っています。今回の報告の中心はその再実装ではなく、投球区間の候補も同じ動画に適用し、投球と各状況を照合した結果です。</w:t>
       </w:r>
     </w:p>
     <w:p>
@@ -261,12 +282,12 @@
         <w:pStyle w:val="Heading2"/>
       </w:pPr>
       <w:r>
-        <w:t>Q5. 541観測を取得できたという数字は正解率ですか。</w:t>
+        <w:t>Q6. 34候補群は34球ということですか。</w:t>
       </w:r>
     </w:p>
     <w:p>
       <w:r>
-        <w:t>正解率ではありません。0.5秒ごとの1,061観測中、B/S/Oを取得できた観測が541です。残りは、枠未検出470、今回の位置設定に合わない枠44、ランプ読取不明6です。取得値の正しさは正解注釈との比較が必要です。</w:t>
+        <w:t>実際の投球数とは限りません。Soft-NMS後の65区間を、最高スコア候補との時間的IoUが0.25以上の重なりで、表示上34群に整理した数です。誤検出や重複、見逃しは正解注釈と照合する必要があります。</w:t>
       </w:r>
     </w:p>
     <w:p>
@@ -274,12 +295,12 @@
         <w:pStyle w:val="Heading2"/>
       </w:pPr>
       <w:r>
-        <w:t>Q6. 23候補群で表示が不足したのはなぜですか。</w:t>
+        <w:t>Q7. 2ストライク後のファウルは2球検出できたのですか。</w:t>
       </w:r>
     </w:p>
     <w:p>
       <w:r>
-        <w:t>照合に使う前後の範囲に、必要な安定したカウントがないためです。カメラ切替で表示が消えた場合や、検出失敗、対応しない表示形式などが考えられます。23件すべての原因を個別に確定したわけではありません。</w:t>
+        <w:t>現行の照合でカウント不変となった確認対象が2候補群です。ファウル確定の数ではありません。候補11は直後158.0秒ではB0S2O1ですが、161.5秒にはB1S2O1を取得しており、直後の値だけで不変と決める問題が見つかりました。</w:t>
       </w:r>
     </w:p>
     <w:p>
@@ -287,12 +308,12 @@
         <w:pStyle w:val="Heading2"/>
       </w:pPr>
       <w:r>
-        <w:t>Q7. 前回の平均tIoU 0.711より改善しましたか。</w:t>
+        <w:t>Q8. では、候補11を除いた1候補がファウルということですか。</w:t>
       </w:r>
     </w:p>
     <w:p>
       <w:r>
-        <w:t>今回の動画全体には正解注釈がなく、改善したかはまだ分かりません。前回の値は短編10動画の24球について、目視の参考区間と選んだ候補を比較した値で、今回のイベント判定や誤検出込みの精度とは評価対象が異なります。</w:t>
+        <w:t>まだ1球とも確定できません。後の取得値と矛盾する例が1つ見つかったことと、残りが実際にファウルだと確認できたことは別です。接触や打球、打席の継続を映像で確認し、正解注釈を付ける必要があります。</w:t>
       </w:r>
     </w:p>
     <w:p>
@@ -300,12 +321,12 @@
         <w:pStyle w:val="Heading2"/>
       </w:pPr>
       <w:r>
-        <w:t>Q8. 新たに学習し直したのですか。</w:t>
+        <w:t>Q9. 161.5秒の値はどのように確認しましたか。</w:t>
       </w:r>
     </w:p>
     <w:p>
       <w:r>
-        <w:t>今回の動画での追加学習や、3モデルをまとめた共同学習はしていません。既存のYOLO重み、公開OCRモデル、固定したVideoMAE、以前inning1tで学習したCompact ActionFormerを組み合わせました。</w:t>
+        <w:t>保存済みの0.5秒ごとの認識値と、元動画の同じ時刻の画像を確認しました。158.0–158.5秒の値はB0S2O1ですが、159.0秒からは未取得となり、161.5秒にB1S2O1を取得しています。新しくモデルを再学習した結果ではなく、既存の認識記録の時刻を追った追加確認です。</w:t>
       </w:r>
     </w:p>
     <w:p>
@@ -313,12 +334,12 @@
         <w:pStyle w:val="Heading2"/>
       </w:pPr>
       <w:r>
-        <w:t>Q9. なぜtest.mp4ではなく5ura.mp4を使いましたか。</w:t>
+        <w:t>Q10. 自動処理はなぜ後の値を採用しなかったのですか。</w:t>
       </w:r>
     </w:p>
     <w:p>
       <w:r>
-        <w:t>test.mp4は約134分35秒あり、GPUのない今回のCPU環境では1時間以内の処理が見込めなかったためです。指定していた代替の5ura.mp4全体、530.2秒を処理しました。短いファウル抜粋動画で代用したわけではありません。</w:t>
+        <w:t>現行ルールは投球後0.5秒以降から10秒までの範囲で、最初の安定したB/S/Oを採用するためです。候補11は158.0–158.5秒に同じ状態が2観測続いたので、その値を採用しました。次の候補との混同も避けながら、表示更新や再表示の確認をどう採用条件に入れるかが課題です。</w:t>
       </w:r>
     </w:p>
     <w:p>
@@ -326,12 +347,12 @@
         <w:pStyle w:val="Heading2"/>
       </w:pPr>
       <w:r>
-        <w:t>Q10. スコア0.966は96.6％正しいという意味ですか。</w:t>
+        <w:t>Q11. 得点が入った投球も特定できたのですか。</w:t>
       </w:r>
     </w:p>
     <w:p>
       <w:r>
-        <w:t>そのようには解釈できません。Compact ActionFormerの投球区間候補のスコアで、正答確率として校正していません。ファウルの確率でもありません。</w:t>
+        <w:t>まだ特定できていません。候補26付近では0対0、候補31の直後では0対1と、投球付近の状況を記録しました。間の表示に欠測があるため、候補26が得点の原因だった、何秒で得点した、とは結論付けていません。</w:t>
       </w:r>
     </w:p>
     <w:p>
@@ -339,12 +360,12 @@
         <w:pStyle w:val="Heading2"/>
       </w:pPr>
       <w:r>
-        <w:t>Q11. 1という得点を、形から決め打ちしたのですか。</w:t>
+        <w:t>Q12. 9/34や541/1061を精度として使えますか。</w:t>
       </w:r>
     </w:p>
     <w:p>
       <w:r>
-        <w:t>形だけで決めていません。得点欄をOCRの文字認識モデルへ直接渡し、全領域と余白を狭めた領域の2通りが、どちらも信頼度0.8以上で同じ数値を返す場合だけ補助値を採用しました。今回の対象では27欄に適用しました。</w:t>
+        <w:t>使えません。9/34は必要な前後の項目が揃った候補群の割合で、541/1061はB/S/Oの取得値がある観測の割合です。今回の動画の正解注釈に対する正答率、適合率、再現率ではありません。</w:t>
       </w:r>
     </w:p>
     <w:p>
@@ -352,12 +373,12 @@
         <w:pStyle w:val="Heading2"/>
       </w:pPr>
       <w:r>
-        <w:t>Q12. 同じ数字が続けば、時間を長く待つだけで解決しますか。</w:t>
+        <w:t>Q13. 以前の適合率や平均tIoUより改善しましたか。</w:t>
       </w:r>
     </w:p>
     <w:p>
       <w:r>
-        <w:t>待機時間を延ばすだけでは、次の投球や別の表示を混ぜる可能性もあります。次の投球より前という制約を付け、表示の更新や再表示を確認し、根拠が不足すれば保留する必要があります。具体的な条件は正解注釈と照合して検討します。</w:t>
+        <w:t>条件と評価対象が異なるため、今回は改善したかを評価していません。静止画の表示認識、短編の投球区間の重なり、今回の投球と状況の対応付けは別の評価です。9候補群が揃ったことを精度向上としては示していません。</w:t>
       </w:r>
     </w:p>
     <w:p>
@@ -365,12 +386,12 @@
         <w:pStyle w:val="Heading2"/>
       </w:pPr>
       <w:r>
-        <w:t>Q13. 先行研究の調査は進みましたか。</w:t>
+        <w:t>Q14. 全部というのは、4月の骨格推定も含めていますか。</w:t>
       </w:r>
     </w:p>
     <w:p>
       <w:r>
-        <w:t>今週は統合処理と同じ動画への適用確認を優先しました。先行研究の調査結果は今回の報告には含めていません。投球と守備動作の区別、映像と表示の統合に関する手法を今後整理します。</w:t>
+        <w:t>今回まとめて適用したのは、現在の研究で実装してきたYOLOによるスコアボードと内部表示、PaddleOCRによる回・得点、VideoMAEとCompact ActionFormerによる投球区間の検出です。4月に検討したGASTによる3D骨格解析を、今回実行したわけではありません。</w:t>
       </w:r>
     </w:p>
     <w:p>
@@ -378,12 +399,12 @@
         <w:pStyle w:val="Heading2"/>
       </w:pPr>
       <w:r>
-        <w:t>Q14. 今回できたことと、まだできていないことは何ですか。</w:t>
+        <w:t>Q15. 今週は学習し直したのですか。</w:t>
       </w:r>
     </w:p>
     <w:p>
       <w:r>
-        <w:t>3つの認識結果を同じ時刻で並べ、前後の表示変化を整理するところまではできました。一方、投球数やファウルを正しく確定できたかの評価は未実施です。正解注釈を作り、区間検出とイベント判定を分けて評価することが次の課題です。</w:t>
+        <w:t>既存モデルの適用と認識結果の対応付けを確認しており、今回の動画での追加学習や3モデルの共同学習はしていません。Compact ActionFormerは以前inning1tで学習した簡略モデルです。</w:t>
       </w:r>
     </w:p>
     <w:p>
@@ -391,16 +412,41 @@
         <w:pStyle w:val="Heading2"/>
       </w:pPr>
       <w:r>
-        <w:t>Q15. 計算精度を変えた影響はありますか。</w:t>
+        <w:t>Q16. 23候補群で表示不足になったのは新たに分かった問題ですか。</w:t>
       </w:r>
     </w:p>
     <w:p>
       <w:r>
-        <w:t>CPU時間を抑えるためVideoMAEのエンコーダーのみBF16を使い、検出器はFP32です。過去の23.8秒の参照動画全体でFP32版と比較し、残った5提案の区間は対応する区間同士のtIoUが0.997以上、スコア差は0.0024以下でした。これは数値的一致の確認で、正解に対する検出精度の証明ではありません。</w:t>
+        <w:t>表示が消えるとイベント推定が難しくなる問題自体は、以前から確認していました。今回は、その問題が投球の前後照合にも影響し、現行条件では23候補群でB/S/Oが揃わなかったことを整理しました。23群すべての個別原因を確定したわけではありません。</w:t>
+      </w:r>
+    </w:p>
+    <w:p>
+      <w:pPr>
+        <w:pStyle w:val="Heading2"/>
+      </w:pPr>
+      <w:r>
+        <w:t>Q17. 以前に5回裏を短縮した研究とは何が違いますか。</w:t>
+      </w:r>
+    </w:p>
+    <w:p>
+      <w:r>
+        <w:t>5月には、スコアボードを使って5回裏の8分50秒を4分15秒に短縮した結果を報告しています。今回は、同じ長さの動画に投球区間検出も適用し、投球候補にカウント・走者・回・得点を対応付けた結果を報告しています。今回のダイジェストの長さや短縮率を新たに比較したわけではありません。</w:t>
+      </w:r>
+    </w:p>
+    <w:p>
+      <w:pPr>
+        <w:pStyle w:val="Heading2"/>
+      </w:pPr>
+      <w:r>
+        <w:t>Q18. 10月2日の平均best tIoU 0.99868とは比較できますか。</w:t>
+      </w:r>
+    </w:p>
+    <w:p>
+      <w:r>
+        <w:t>10月2日は1回表の正解12区間について、重なる検出があるかとbest tIoUを確認した報告です。10月23日の短編10動画24球の参考区間に対する値とも、今回の5回裏全体の項目取得数とも対象・集計方法が異なります。今回の9候補群を、どちらかの精度より良い・悪いとは比較していません。</w:t>
       </w:r>
     </w:p>
     <w:sectPr>
-      <w:footerReference w:type="default" r:id="rId9"/>
       <w:pgSz w:w="12240" w:h="15840"/>
       <w:pgMar w:top="1008" w:right="1152" w:bottom="1008" w:left="1152" w:header="720" w:footer="720" w:gutter="0"/>
       <w:cols w:space="720"/>
@@ -408,18 +454,6 @@
     </w:sectPr>
   </w:body>
 </w:document>
-</file>
-
-<file path=word/footer1.xml><?xml version="1.0" encoding="utf-8"?>
-<w:ftr xmlns:m="http://schemas.openxmlformats.org/officeDocument/2006/math" xmlns:mc="http://schemas.openxmlformats.org/markup-compatibility/2006" xmlns:mo="http://schemas.microsoft.com/office/mac/office/2008/main" xmlns:mv="urn:schemas-microsoft-com:mac:vml" xmlns:o="urn:schemas-microsoft-com:office:office" xmlns:r="http://schemas.openxmlformats.org/officeDocument/2006/relationships" xmlns:v="urn:schemas-microsoft-com:vml" xmlns:w10="urn:schemas-microsoft-com:office:word" xmlns:w14="http://schemas.microsoft.com/office/word/2010/wordml" xmlns:w="http://schemas.openxmlformats.org/wordprocessingml/2006/main" xmlns:wne="http://schemas.microsoft.com/office/word/2006/wordml" xmlns:wp14="http://schemas.microsoft.com/office/word/2010/wordprocessingDrawing" xmlns:wp="http://schemas.openxmlformats.org/drawingml/2006/wordprocessingDrawing" xmlns:wpc="http://schemas.microsoft.com/office/word/2010/wordprocessingCanvas" xmlns:wpg="http://schemas.microsoft.com/office/word/2010/wordprocessingGroup" xmlns:wpi="http://schemas.microsoft.com/office/word/2010/wordprocessingInk" xmlns:wps="http://schemas.microsoft.com/office/word/2010/wordprocessingShape" mc:Ignorable="w14 wp14">
-  <w:p>
-    <w:pPr>
-      <w:pStyle w:val="Footer"/>
-      <w:jc w:val="right"/>
-    </w:pPr>
-    <w:fldSimple w:instr="PAGE"/>
-  </w:p>
-</w:ftr>
 </file>
 
 <file path=word/numbering.xml><?xml version="1.0" encoding="utf-8"?>

</xml_diff>

<commit_message>
Explain conclusions from integrated results with clearer examples
</commit_message>
<xml_diff>
--- a/presentations/20261030/speaker_notes.docx
+++ b/presentations/20261030/speaker_notes.docx
@@ -14,7 +14,7 @@
       <w:r>
         <w:t>37023492　棚橋 悠</w:t>
         <w:br/>
-        <w:t>本編11枚＋補足2枚。本文をそのまま読み上げる想定です。</w:t>
+        <w:t>本編9枚＋補足4枚。本文をそのまま読み上げる想定です。</w:t>
       </w:r>
     </w:p>
     <w:p>
@@ -27,7 +27,7 @@
     </w:p>
     <w:p>
       <w:r>
-        <w:t>今週は、これまでに実装してきたスコアボード認識と投球区間の検出を、5回裏の同じ動画全体に適用しました。今回は、全部を適用してどのような状況を投球に対応付けられたかと、そこで残った課題を報告します。</w:t>
+        <w:t>今週は、これまでの認識処理を、5回裏の動画全体にまとめて適用しました。今回の結果から、投球に試合状況を付けて記録できたことと、投球の結果を判断するには表示を確認する時刻が重要だということを報告します。</w:t>
       </w:r>
     </w:p>
     <w:p>
@@ -35,12 +35,12 @@
         <w:pStyle w:val="Heading1"/>
       </w:pPr>
       <w:r>
-        <w:t>2. これまでの研究と今週の位置付け</w:t>
+        <w:t>2. 今週の結果からいえること</w:t>
       </w:r>
     </w:p>
     <w:p>
       <w:r>
-        <w:t>これまでは、YOLOでカウントと走者を検出し、PaddleOCRでイニングと得点を認識してきました。9月には、表示の変化を使ったイベントの推定とCSVへの出力も行っています。その後、VideoMAEの特徴量とCompact ActionFormerを使い、投球区間を確認してきました。今週は、これらの処理を5回裏全体にまとめて適用し、投球候補と、カウント、走者、回、得点を同じ動画の時刻で対応付けました。投球と各状況を一緒に照合した結果が、今回の報告の中心です。</w:t>
+        <w:t>今回、まずいえるのは、検出した投球場面に、カウントや走者、回、得点をまとめて付けて記録できたことです。一方、投球直後のカウントが変わらなくても、それだけでファウルとは判断できませんでした。また、投球の候補が見つかっても、その前後の表示が不足すると、結果を判断できない場面がありました。今回は、この3点を具体的な場面で説明します。</w:t>
       </w:r>
     </w:p>
     <w:p>
@@ -48,12 +48,12 @@
         <w:pStyle w:val="Heading1"/>
       </w:pPr>
       <w:r>
-        <w:t>3. 今週まとめて適用した内容</w:t>
+        <w:t>3. どんな状況の投球か記録できた</w:t>
       </w:r>
     </w:p>
     <w:p>
       <w:r>
-        <w:t>対象は5ura.mp4の全体、530.2秒です。既存の学習済みモデルを使い、今回の動画での追加学習はしていません。YOLOでB/S/Oと走者、PaddleOCRで回と得点を読み、VideoMAEとCompact ActionFormerで投球区間の候補を出しました。投球候補の前後で同じB/S/Oが連続して得られる範囲を探し、状況を対応付けました。現行の照合では、投球後に最初に得られた安定状態を使っています。この表示の採用時刻が、後で説明する課題につながりました。</w:t>
+        <w:t>一つ目は、どんな状況の投球かを記録できたことです。この場面では、投球と予測した区間に、5回裏、同点、一塁走者あり、2アウトという情報を付けられました。投球前は2ボール0ストライクで、投球後に取得した表示は2ボール1ストライクでした。これにより、この状況で投球があり、その後にストライク表示が増えたという流れを、一つの記録として確認できています。YOLOによるカウントと走者、OCRによる回と得点、VideoMAEによる投球区間を組み合わせたことで、投球の時間と試合状況を結び付けられました。</w:t>
       </w:r>
     </w:p>
     <w:p>
@@ -61,12 +61,12 @@
         <w:pStyle w:val="Heading1"/>
       </w:pPr>
       <w:r>
-        <w:t>4. 全処理を動画全体に適用した結果</w:t>
+        <w:t>4. 投球直後の表示だけでは決められない</w:t>
       </w:r>
     </w:p>
     <w:p>
       <w:r>
-        <w:t>全体の適用結果です。投球区間の候補は65区間で、重なりを表示上まとめると34候補群でした。34は実際の投球数を確定した値ではありません。上から、投球区間候補、B/S/O、走者、得点を同じ時刻で並べています。走者欄の黄色はあり、灰色はなしと認識した時刻で、白は未取得です。このように、投球だけでなく、その付近の試合状況も同じ時系列で追える形にしました。読み取れない場所は、0や走者なしで埋めていません。</w:t>
+        <w:t>二つ目は、投球直後の表示だけでは結果を決められないことです。この場面では、投球前と直後の158.0秒は、どちらも0ボール2ストライク1アウトでした。ここだけ見ると、2ストライク後にカウントが変わらないため、ファウルの確認対象になります。しかし、161.5秒の表示は1ボール2ストライク1アウトでした。少し後まで確認すると、ボールが増えた状態を取得しています。この例から、直後に変化がないことを、そのまま最終的な結果として扱わない必要があると分かりました。</w:t>
       </w:r>
     </w:p>
     <w:p>
@@ -74,12 +74,12 @@
         <w:pStyle w:val="Heading1"/>
       </w:pPr>
       <w:r>
-        <w:t>5. 前後の全項目が揃ったのは9候補群</w:t>
+        <w:t>5. 同じ値が続いても、更新前かもしれない</w:t>
       </w:r>
     </w:p>
     <w:p>
       <w:r>
-        <w:t>34候補群のうち、前後のB/S/Oを照合できたものは11候補群でした。そのうち9候補群では、B/S/Oに加えて、回と表裏、両チームの得点、各塁の走者の認識値も前後で揃いました。残りの2候補群は、OCRの項目が一部取得できていません。前後のB/S/Oが不足したものは23候補群でした。これは、全処理を適用したときに必要な項目が揃った数であり、9候補群で正しくイベントを判定できたという意味ではありません。</w:t>
+        <w:t>現在の処理は、同じカウントが連続2回得られると、安定した値として採用しています。ただ、先ほどの場面では、158.0秒と158.5秒に同じ値が続いていましたが、その後の161.5秒には値が変わっていました。同じ表示が続いたことと、その表示が今回の投球後の状態に更新されていることは、別の確認が必要です。次の改善では、連続して同じ値が得られたかに加えて、今回の投球後の表示として採用してよいかを検討する必要があります。</w:t>
       </w:r>
     </w:p>
     <w:p>
@@ -87,12 +87,12 @@
         <w:pStyle w:val="Heading1"/>
       </w:pPr>
       <w:r>
-        <w:t>6. 投球にカウントと走者・得点を付与</w:t>
+        <w:t>6. 表示の欠けた場面は結果を保留する</w:t>
       </w:r>
     </w:p>
     <w:p>
       <w:r>
-        <w:t>全項目を対応付けた例です。293.11秒から294.85秒に投球候補があり、その前後は5回裏、0対0、一塁走者あり、2アウトという状況でした。投球前の291.5秒では2ボール0ストライク、投球後に表示を取得した297.5秒では2ボール1ストライクです。回、得点、走者が変わらず、ストライク表示が増えたことを、この投球候補に対応付けられました。投球区間だけを出す場合や、表示の変化だけを見る場合よりも、どの状況の投球で表示が変わったかまで記録できています。</w:t>
+        <w:t>三つ目は、投球を検出できても、表示が欠けると結果を判断できないことです。この場面では、367.0秒の投球付近にカウントと走者の表示がありますが、370.0秒には守備側へカメラが切り替わり、スコアボードが映っていません。そのため、投球後にどのように状況が変わったかを、表示だけでは比較できません。表示が消える問題自体は以前からありましたが、今回、投球検出と組み合わせても前後の情報が不足する場面が残りました。このような場面は、誤った結果を決めず、保留にする必要があります。</w:t>
       </w:r>
     </w:p>
     <w:p>
@@ -100,12 +100,12 @@
         <w:pStyle w:val="Heading1"/>
       </w:pPr>
       <w:r>
-        <w:t>7. 得点・走者の異なる状況も記録</w:t>
+        <w:t>7. 得点した投球の特定には課題が残る</w:t>
       </w:r>
     </w:p>
     <w:p>
       <w:r>
-        <w:t>別の例では、候補26の区間内にある367.0秒で、5回裏、0対0、3ボール2ストライク2アウト、二塁走者ありという値を取得しました。一方、候補31の直後の436.5秒では、5回裏、0対1、0ボール0ストライク2アウト、一塁走者ありでした。得点だけでなく、投球候補と、その付近のカウントや走者を一緒に記録できています。ただし、間の表示が不足しているため、候補26が得点につながった投球だった、あるいは何秒で得点した、という対応までは確定していません。</w:t>
+        <w:t>得点についても、何が分かり、何がまだ分からないかを分ける必要があります。367.0秒には0対0、436.5秒には0対1という表示を取得し、それぞれの付近の投球候補にカウントや走者も付けて記録できました。ただし、その間の表示に欠けた部分があるため、どの投球で得点したかまでは特定していません。得点が変わったことを記録する段階から、得点につながった投球やプレーを特定するには、途中の映像や表示も対応付ける必要があります。</w:t>
       </w:r>
     </w:p>
     <w:p>
@@ -113,12 +113,12 @@
         <w:pStyle w:val="Heading1"/>
       </w:pPr>
       <w:r>
-        <w:t>8. 2ストライク後の条件を投球に適用</w:t>
+        <w:t>8. 今回いえること</w:t>
       </w:r>
     </w:p>
     <w:p>
       <w:r>
-        <w:t>9月に考えた、2ストライクで投球の前後の状況が変わらない場面という条件を、今回は検出した投球区間の前後に適用しました。現行の最初の安定状態を使う照合では、113.41秒から115.02秒と、155.31秒から157.27秒の2候補群が、B/S/O不変として残りました。どちらも0ボール2ストライク1アウトです。ただし、これは自動処理が確認対象として残した数で、ファウルを2件正しく検出できたという意味ではありません。</w:t>
+        <w:t>今回のまとめです。投球区間と表示認識を組み合わせることで、検出した投球に、そのときの試合状況を付けて記録できました。その一方で、投球の結果を決めるには、表示が取得できることに加え、その表示を確認する時刻が重要だと分かりました。特に、カウント不変という条件は、ファウルとして確定する条件にはまだなっていません。今週は、情報を一緒に記録するところまで進み、正しいイベント判定へつなげるために必要な確認を具体化できました。</w:t>
       </w:r>
     </w:p>
     <w:p>
@@ -126,38 +126,12 @@
         <w:pStyle w:val="Heading1"/>
       </w:pPr>
       <w:r>
-        <w:t>9. 表示の採用時刻で照合結果が変わる</w:t>
+        <w:t>9. 来週すること</w:t>
       </w:r>
     </w:p>
     <w:p>
       <w:r>
-        <w:t>候補11について、投球後の表示を続けて確認しました。投球前の154.5秒と、直後の158.0秒は、どちらも0ボール2ストライク1アウトです。しかし、その後の161.5秒では、1ボール2ストライク1アウトを取得しています。元の照合は、158.0秒から158.5秒の最初の安定状態を採用したため、不変と整理されていました。同じ認識記録でも、その後の値を確認すると、ボールが増えた状態になります。このため、直後の古い表示で判定していないかを確認する必要があります。認識値の違いを示したもので、実際の投球結果の正解判定は別に必要です。</w:t>
-      </w:r>
-    </w:p>
-    <w:p>
-      <w:pPr>
-        <w:pStyle w:val="Heading1"/>
-      </w:pPr>
-      <w:r>
-        <w:t>10. 全処理の適用で分かったこと</w:t>
-      </w:r>
-    </w:p>
-    <w:p>
-      <w:r>
-        <w:t>今週新たに確認した点は、投球区間に、カウント、走者、回、得点をまとめて付与できたことです。前後の全項目が揃ったのは9候補群でした。また、表示変化の時刻だけではなく、それに対応する投球候補まで示せるようになりました。一方、前後の表示が不足する23候補群があり、取得できても採用する時刻によって不変という整理が変わる例がありました。各認識処理の結果を並べるだけでなく、どの時点の表示を投球に対応付けるかが、イベント判定に必要だと分かりました。</w:t>
-      </w:r>
-    </w:p>
-    <w:p>
-      <w:pPr>
-        <w:pStyle w:val="Heading1"/>
-      </w:pPr>
-      <w:r>
-        <w:t>11. 来週すること</w:t>
-      </w:r>
-    </w:p>
-    <w:p>
-      <w:r>
-        <w:t>次は5回裏全体に、実際の投球区間と、ファウルなどの結果の正解注釈を付けます。そのうえで、表示の更新や再表示を待つ方法と、前後の採用値の決め方を検討します。投球区間の見逃しや誤検出の評価と、その投球へ正しい状況や結果を対応付けたかの評価は分けて行います。今回の動画を使った調整の後には、別の動画でも確認します。今週は、全部を適用した結果を取得する段階から、投球と状況の対応付けを評価するための具体的な課題まで整理しました。</w:t>
+        <w:t>来週は、まず実際の投球区間と結果を目視で記録し、正解を用意します。次に、投球直後の古い表示を採用していないかを確認し、表示の再出現や、投球後の映像を使う方法を検討します。ファウルではカウントが変わらないため、単に値が変わるまで待つ方法にはしません。そのうえで、投球を正しく見つけられたかと、その結果を正しく判断できたかを分けて評価し、別の動画でも確認します。</w:t>
       </w:r>
     </w:p>
     <w:p>
@@ -178,7 +152,33 @@
         <w:pStyle w:val="Heading1"/>
       </w:pPr>
       <w:r>
-        <w:t>12. 補足：他の照合例と結果の内訳</w:t>
+        <w:t>10. 補足：全体の認識結果</w:t>
+      </w:r>
+    </w:p>
+    <w:p>
+      <w:r>
+        <w:t>全体の適用結果です。投球区間の候補は65区間で、重なりを表示上まとめると34候補群でした。34は実際の投球数を確定した値ではありません。上から、投球区間候補、B/S/O、走者、得点を同じ時刻で並べています。走者欄の黄色はあり、灰色はなしと認識した時刻で、白は未取得です。このように、投球だけでなく、その付近の試合状況も同じ時系列で追える形にしました。読み取れない場所は、0や走者なしで埋めていません。</w:t>
+      </w:r>
+    </w:p>
+    <w:p>
+      <w:pPr>
+        <w:pStyle w:val="Heading1"/>
+      </w:pPr>
+      <w:r>
+        <w:t>11. 補足：必要な情報が揃った数</w:t>
+      </w:r>
+    </w:p>
+    <w:p>
+      <w:r>
+        <w:t>34候補群のうち、前後のB/S/Oを照合できたものは11候補群でした。そのうち9候補群では、B/S/Oに加えて、回と表裏、両チームの得点、各塁の走者の認識値も前後で揃いました。残りの2候補群は、OCRの項目が一部取得できていません。前後のB/S/Oが不足したものは23候補群でした。これは、全処理を適用したときに必要な項目が揃った数であり、9候補群で正しくイベントを判定できたという意味ではありません。</w:t>
+      </w:r>
+    </w:p>
+    <w:p>
+      <w:pPr>
+        <w:pStyle w:val="Heading1"/>
+      </w:pPr>
+      <w:r>
+        <w:t>12. 補足：照合例と結果の内訳</w:t>
       </w:r>
     </w:p>
     <w:p>
@@ -191,7 +191,7 @@
         <w:pStyle w:val="Heading1"/>
       </w:pPr>
       <w:r>
-        <w:t>13. 補足：従来の精度評価との違い</w:t>
+        <w:t>13. 補足：従来の評価との違い</w:t>
       </w:r>
     </w:p>
     <w:p>
@@ -444,6 +444,58 @@
     <w:p>
       <w:r>
         <w:t>10月2日は1回表の正解12区間について、重なる検出があるかとbest tIoUを確認した報告です。10月23日の短編10動画24球の参考区間に対する値とも、今回の5回裏全体の項目取得数とも対象・集計方法が異なります。今回の9候補群を、どちらかの精度より良い・悪いとは比較していません。</w:t>
+      </w:r>
+    </w:p>
+    <w:p>
+      <w:pPr>
+        <w:pStyle w:val="Heading2"/>
+      </w:pPr>
+      <w:r>
+        <w:t>Q19. 今回の結論を一文で説明すると何ですか。</w:t>
+      </w:r>
+    </w:p>
+    <w:p>
+      <w:r>
+        <w:t>検出した投球に試合状況を付けて記録できましたが、投球の結果を決めるには、表示を確認する時刻と、その間に欠けた情報を扱う必要がある、ということです。</w:t>
+      </w:r>
+    </w:p>
+    <w:p>
+      <w:pPr>
+        <w:pStyle w:val="Heading2"/>
+      </w:pPr>
+      <w:r>
+        <w:t>Q20. 同じ表示が2回続けば、認識は安定しているのではありませんか。</w:t>
+      </w:r>
+    </w:p>
+    <w:p>
+      <w:r>
+        <w:t>同じ認識値が続いたことは確認できても、その値が投球後に更新されたものかは別です。158.0秒と158.5秒はB0S2O1でしたが、161.5秒にはB1S2O1を取得していました。現行の連続回数だけの条件では、古い表示を採用する可能性が残ります。</w:t>
+      </w:r>
+    </w:p>
+    <w:p>
+      <w:pPr>
+        <w:pStyle w:val="Heading2"/>
+      </w:pPr>
+      <w:r>
+        <w:t>Q21. ファウルではカウントが変わらないのに、どう更新後と判断しますか。</w:t>
+      </w:r>
+    </w:p>
+    <w:p>
+      <w:r>
+        <w:t>単に数値が変わるまで待つ方法では、ファウルを扱えません。表示が消えて戻った場合の比較、投球後の映像や打席の継続、次の投球より前という範囲などの手掛かりを検討します。具体的な採用条件や待機時間の性能は、まだ検証していません。</w:t>
+      </w:r>
+    </w:p>
+    <w:p>
+      <w:pPr>
+        <w:pStyle w:val="Heading2"/>
+      </w:pPr>
+      <w:r>
+        <w:t>Q22. 全部を組み合わせて精度が上がったと言えますか。</w:t>
+      </w:r>
+    </w:p>
+    <w:p>
+      <w:r>
+        <w:t>今回は言えません。組み合わせにより投球と状況を一緒に記録できたことを示しましたが、正解注釈を使った性能比較は未実施です。改善を主張するには、同じデータと指標で個別処理と統合処理を比較する必要があります。</w:t>
       </w:r>
     </w:p>
     <w:sectPr>

</xml_diff>